<commit_message>
Contains Guidelines and Post Launch options
</commit_message>
<xml_diff>
--- a/Devon Dive Guidelines.docx
+++ b/Devon Dive Guidelines.docx
@@ -16,7 +16,19 @@
         <w:t xml:space="preserve"> Testing</w:t>
       </w:r>
       <w:r>
-        <w:t xml:space="preserve"> and Launch guidelines</w:t>
+        <w:t xml:space="preserve"> and</w:t>
+      </w:r>
+      <w:r>
+        <w:t xml:space="preserve"> Launch</w:t>
+      </w:r>
+      <w:r>
+        <w:t>/Post Launch</w:t>
+      </w:r>
+      <w:r>
+        <w:t xml:space="preserve"> guidelines</w:t>
+      </w:r>
+      <w:r>
+        <w:t xml:space="preserve"> and options</w:t>
       </w:r>
     </w:p>
     <w:p/>
@@ -52,6 +64,9 @@
       </w:r>
       <w:r>
         <w:br/>
+      </w:r>
+      <w:r>
+        <w:br/>
         <w:t xml:space="preserve">- </w:t>
       </w:r>
       <w:r>
@@ -149,7 +164,6 @@
         <w:pStyle w:val="Heading2"/>
       </w:pPr>
       <w:r>
-        <w:lastRenderedPageBreak/>
         <w:t>Website Testing Guidelines</w:t>
       </w:r>
     </w:p>
@@ -384,7 +398,19 @@
         <w:t>As touched upon within the accessibility guidelines the use of proper  Semantic HTML tags must be thoroughly tested to ensure screen reader compatibility, the website will be tested to ensure it follows a clear content hierarchy with tags such as headings (e.g. &lt;h1&gt;, &lt;h2&gt;, &lt;h3&gt; etc.). Images will be checked and tested using tools such as NonVisual Desktop Access to ensure alt text has been properly embedded within images. Keyboard Navigation will be tested manually to ensure it is possible to navigate the website through the exclusive use of the keyboard (e.g. Tab and Arrow Keys).</w:t>
       </w:r>
       <w:r>
-        <w:t xml:space="preserve"> To ensure compliance with our commitment to following WCAG, normal text must have a contrast ratio of at least 4.5:1 </w:t>
+        <w:t xml:space="preserve"> To ensure compliance with our commitment to following WCAG</w:t>
+      </w:r>
+      <w:r>
+        <w:t xml:space="preserve"> (</w:t>
+      </w:r>
+      <w:r>
+        <w:t>Web Content Accessibility Guidelines</w:t>
+      </w:r>
+      <w:r>
+        <w:t>)</w:t>
+      </w:r>
+      <w:r>
+        <w:t xml:space="preserve">, normal text must have a contrast ratio of at least 4.5:1 </w:t>
       </w:r>
       <w:r>
         <w:t>and large text being a 3:1 contrast ratio. T</w:t>
@@ -407,6 +433,103 @@
     <w:p>
       <w:r>
         <w:t xml:space="preserve">Before Devon Dive is to be launched, it is imperative to follow a checklist to ensure the site is functional, polished and accessible to ensure it is ready for public release. A final round of testing going through each of the testing guidelines ensuring each set of criteria is met. This includes Functionality testing, compatibility testing, accessibility reviews and testing. If an external database has been used security measures should be verified and tested before launch. The website must be served over HTTPS to ensure the protection of user data and improve user trust. A complete content review should be done on the website to verify there are no spelling mistakes, grammatical errors or inappropriate content on the web page. A backup of the website and any external databases will be made and pushed to GitHub to ensure the existence of a recovery point if anything goes wrong. </w:t>
+      </w:r>
+    </w:p>
+    <w:p>
+      <w:pPr>
+        <w:pStyle w:val="Heading2"/>
+      </w:pPr>
+      <w:r>
+        <w:lastRenderedPageBreak/>
+        <w:t>Ongoing Support</w:t>
+      </w:r>
+    </w:p>
+    <w:p>
+      <w:r>
+        <w:t xml:space="preserve">After the launch of the Devon Dive website, the </w:t>
+      </w:r>
+      <w:r>
+        <w:t>client</w:t>
+      </w:r>
+      <w:r>
+        <w:t xml:space="preserve"> may wish to pursue post launch support. Should the company wish to head in this direction this section will outline and propose several options for the website that may be worked upon</w:t>
+      </w:r>
+      <w:r>
+        <w:t xml:space="preserve"> after the launch</w:t>
+      </w:r>
+      <w:r>
+        <w:t>.</w:t>
+      </w:r>
+    </w:p>
+    <w:p>
+      <w:pPr>
+        <w:pStyle w:val="Heading3"/>
+      </w:pPr>
+      <w:r>
+        <w:t>Post Launch Support</w:t>
+      </w:r>
+    </w:p>
+    <w:p>
+      <w:r>
+        <w:t>Due to devon dive offering a commercial service to users, technical troubleshooting would be a key post launch option to offer. This would involve assisting the client if any bugs, unexpected behaviour or website performance related issues are to occur</w:t>
+      </w:r>
+      <w:r>
+        <w:t>,</w:t>
+      </w:r>
+      <w:r>
+        <w:t xml:space="preserve"> </w:t>
+      </w:r>
+      <w:r>
+        <w:t>an</w:t>
+      </w:r>
+      <w:r>
+        <w:t xml:space="preserve"> example</w:t>
+      </w:r>
+      <w:r>
+        <w:t xml:space="preserve"> of this would be</w:t>
+      </w:r>
+      <w:r>
+        <w:t>, if the website is unable to perform effectively under real world traffic the company can aid with troubleshooting</w:t>
+      </w:r>
+      <w:r>
+        <w:t>. T</w:t>
+      </w:r>
+      <w:r>
+        <w:t>his ensure</w:t>
+      </w:r>
+      <w:r>
+        <w:t>s</w:t>
+      </w:r>
+      <w:r>
+        <w:t xml:space="preserve"> that the user experience remains smooth and </w:t>
+      </w:r>
+      <w:r>
+        <w:t xml:space="preserve">user </w:t>
+      </w:r>
+      <w:r>
+        <w:t>friendly. Another crucial ongoing support feature would be regular content updates. As the Devon Dive brand grows and progresses, the client may wish to add new images, pages, update pricing and offer a wider range of services by providing regular content updates to the Devon Dive site this would allow the site to stay dynamic and relevant for returning and future users.</w:t>
+      </w:r>
+      <w:r>
+        <w:t xml:space="preserve"> A third post launch support option that could be provided is User feedback analysis. After launch real users may begin to provide feedback about their website experience. Support for the client could include helping them collect, review and interpret this feedback to identify realistic room for improvement on the website. A final post launch support consideration would be regular accessibility audits to ensure the website is remaining compliant with the latest WCAG (</w:t>
+      </w:r>
+      <w:r>
+        <w:t>Web Content Accessibility Guidelines</w:t>
+      </w:r>
+      <w:r>
+        <w:t>), ensuring that the site not only remains relevant and optimised for search engines but to keep the user experience enjoyable with any new content additions to the website.</w:t>
+      </w:r>
+    </w:p>
+    <w:p>
+      <w:pPr>
+        <w:pStyle w:val="Heading3"/>
+      </w:pPr>
+      <w:r>
+        <w:t>Maintenance</w:t>
+      </w:r>
+    </w:p>
+    <w:p>
+      <w:r>
+        <w:t>Maintenance on the Devon Dive website will involve regular work that ensures the website remains in a functional and optimal condition. A core part of this will be regularly applying software updates, keeping any used libraries, plugins and third-party tools up to date. Keeping this up to date is imperative to prevent compatibility issues, add new features through post launch content updates and fix bugs. As Devon Dive offers goods and services to users, it is vital that regular security monitoring and patching takes place. The security emplacements of yesterday and never as good as the security of today, new vulnerabilities emerge over time and can be a massive risk for the client and their company. By ensuring regular necessary security patches and ensuring protections such as firewalls and SSL certificates are always active and up to date the longevity of the website can be increased significantly. Back up management will play a huge role in this, by having regular scheduled backups of the site’s files and database potential loss of assets can be prevented in the event of server failure, hacking, or accidental data loss. By having regular back-ups as part of post-launch maintenance the site can be quickly restored to its last backed up state with minimal disruption to up-time. Finally providing regular testing after updates is an important part of maintaining a website. After any major updates to software or systems of the website, functionality, compatibility and responsiveness will be extensively tested to ensure that navigation, forms and various other components of the website continue to work as expected.</w:t>
       </w:r>
     </w:p>
     <w:sectPr>

</xml_diff>